<commit_message>
docs: atualiza arquivos PIT na pasta Docs
Co-Authored-By: Claude Sonnet 4.6 <noreply@anthropic.com>
</commit_message>
<xml_diff>
--- a/Docs/PIT - Claudio Matteo.docx
+++ b/Docs/PIT - Claudio Matteo.docx
@@ -222,20 +222,16 @@
             <w:u w:val="single"/>
             <w:rtl w:val="0"/>
           </w:rPr>
-          <w:t xml:space="preserve">https://github.com/matteolima/cupcake-store/blob/main/Docs/Documentacao%20-%20PIT-%20Claudio%20Matteo.docx.pdf</w:t>
+          <w:t xml:space="preserve">https://github.com/matteolima/cupcake-store/blob/main/Docs/Documentacao%20-%20PIT-%20Claudio%20Matteo.pdf</w:t>
         </w:r>
       </w:hyperlink>
       <w:r>
         <w:rPr>
           <w:rFonts w:ascii="Arial" w:cs="Arial" w:eastAsia="Arial" w:hAnsi="Arial"/>
+          <w:u w:val="none"/>
           <w:rtl w:val="0"/>
         </w:rPr>
         <w:t xml:space="preserve"> </w:t>
-      </w:r>
-      <w:r>
-        <w:rPr>
-          <w:rtl w:val="0"/>
-        </w:rPr>
       </w:r>
     </w:p>
     <w:p>

</xml_diff>